<commit_message>
Actualizar la propuesta comercial con la nueva estrategia de oferta
Regenera el DOCX para reflejar los cambios de la mejora de oferta:
- Aviso de cupos limitados (3-4 clientes/mes) al inicio de la sección
  de planes
- Nota de que el Agente IA solo cuesta $199.990/mes, haciendo evidente
  el valor de Turbo por $100.000 más
- Nueva sección "4. Servicios puntuales" con Agente IA ($119.990/mes
  lanzamiento), sesión audiovisual, página web y setup de Meta Ads
- Mención de "proyectos a medida desde $500.000/mes" en próximos pasos
- Renumeración de las secciones siguientes (5 a 8)

Co-Authored-By: Claude Sonnet 5 <noreply@anthropic.com>
</commit_message>
<xml_diff>
--- a/documentos/propuesta-comercial-manyobra.docx
+++ b/documentos/propuesta-comercial-manyobra.docx
@@ -589,7 +589,7 @@
     </w:p>
     <w:p>
       <w:pPr>
-        <w:spacing w:after="200" w:before="0" w:line="276"/>
+        <w:spacing w:after="120" w:before="0" w:line="276"/>
       </w:pPr>
       <w:r>
         <w:rPr>
@@ -599,6 +599,76 @@
           <w:szCs w:val="21"/>
         </w:rPr>
         <w:t xml:space="preserve">Cada plan incluye todo lo del anterior. Los valores son mensuales y no incluyen IVA.</w:t>
+      </w:r>
+    </w:p>
+    <w:tbl>
+      <w:tblPr>
+        <w:tblW w:type="dxa" w:w="9360"/>
+        <w:tblBorders>
+          <w:top w:val="single" w:color="auto" w:sz="4"/>
+          <w:left w:val="single" w:color="auto" w:sz="4"/>
+          <w:bottom w:val="single" w:color="auto" w:sz="4"/>
+          <w:right w:val="single" w:color="auto" w:sz="4"/>
+          <w:insideH w:val="single" w:color="auto" w:sz="4"/>
+          <w:insideV w:val="single" w:color="auto" w:sz="4"/>
+        </w:tblBorders>
+      </w:tblPr>
+      <w:tblGrid>
+        <w:gridCol w:w="9360"/>
+      </w:tblGrid>
+      <w:tr>
+        <w:tc>
+          <w:tcPr>
+            <w:tcW w:type="dxa" w:w="9360"/>
+            <w:shd w:fill="EEF3FF" w:color="auto" w:val="clear"/>
+            <w:tcMar>
+              <w:top w:type="dxa" w:w="90"/>
+              <w:left w:type="dxa" w:w="130"/>
+              <w:bottom w:type="dxa" w:w="90"/>
+              <w:right w:type="dxa" w:w="130"/>
+            </w:tcMar>
+            <w:vAlign w:val="center"/>
+          </w:tcPr>
+          <w:p>
+            <w:pPr>
+              <w:spacing w:after="0" w:before="0" w:line="276"/>
+            </w:pPr>
+            <w:r>
+              <w:rPr>
+                <w:rFonts w:ascii="Calibri" w:cs="Calibri" w:eastAsia="Calibri" w:hAnsi="Calibri"/>
+                <w:b/>
+                <w:bCs/>
+                <w:color w:val="1D4ED8"/>
+                <w:sz w:val="21"/>
+                <w:szCs w:val="21"/>
+              </w:rPr>
+              <w:t xml:space="preserve">Cupos limitados: </w:t>
+            </w:r>
+            <w:r>
+              <w:rPr>
+                <w:rFonts w:ascii="Calibri" w:cs="Calibri" w:eastAsia="Calibri" w:hAnsi="Calibri"/>
+                <w:color w:val="111111"/>
+                <w:sz w:val="21"/>
+                <w:szCs w:val="21"/>
+              </w:rPr>
+              <w:t xml:space="preserve">tomamos solo 3 a 4 clientes nuevos al mes para mantener la calidad de producción.</w:t>
+            </w:r>
+          </w:p>
+        </w:tc>
+      </w:tr>
+    </w:tbl>
+    <w:p>
+      <w:pPr>
+        <w:spacing w:after="160" w:before="0" w:line="276"/>
+      </w:pPr>
+      <w:r>
+        <w:rPr>
+          <w:rFonts w:ascii="Calibri" w:cs="Calibri" w:eastAsia="Calibri" w:hAnsi="Calibri"/>
+          <w:color w:val="111111"/>
+          <w:sz w:val="21"/>
+          <w:szCs w:val="21"/>
+        </w:rPr>
+        <w:t xml:space="preserve"/>
       </w:r>
     </w:p>
     <w:tbl>
@@ -2772,6 +2842,45 @@
     </w:tbl>
     <w:p>
       <w:pPr>
+        <w:spacing w:after="0" w:before="160" w:line="276"/>
+      </w:pPr>
+      <w:r>
+        <w:rPr>
+          <w:rFonts w:ascii="Calibri" w:cs="Calibri" w:eastAsia="Calibri" w:hAnsi="Calibri"/>
+          <w:color w:val="666666"/>
+          <w:sz w:val="19"/>
+          <w:szCs w:val="19"/>
+        </w:rPr>
+        <w:t xml:space="preserve">El Agente IA contratado por separado cuesta </w:t>
+      </w:r>
+      <w:r>
+        <w:rPr>
+          <w:rFonts w:ascii="Calibri" w:cs="Calibri" w:eastAsia="Calibri" w:hAnsi="Calibri"/>
+          <w:b/>
+          <w:bCs/>
+          <w:color w:val="1D4ED8"/>
+          <w:sz w:val="19"/>
+          <w:szCs w:val="19"/>
+        </w:rPr>
+        <w:t xml:space="preserve">$199.990/mes</w:t>
+      </w:r>
+      <w:r>
+        <w:rPr>
+          <w:rFonts w:ascii="Calibri" w:cs="Calibri" w:eastAsia="Calibri" w:hAnsi="Calibri"/>
+          <w:color w:val="666666"/>
+          <w:sz w:val="19"/>
+          <w:szCs w:val="19"/>
+        </w:rPr>
+        <w:t xml:space="preserve">. Con el Plan Turbo lo tienes incluido, más todo el sistema de contenido, pauta y web, por solo $100.000 más que Impulso.</w:t>
+      </w:r>
+    </w:p>
+    <w:p>
+      <w:r>
+        <w:br w:type="page"/>
+      </w:r>
+    </w:p>
+    <w:p>
+      <w:pPr>
         <w:pStyle w:val="Heading1"/>
         <w:pBdr>
           <w:bottom w:val="single" w:color="1D4ED8" w:sz="12" w:space="6"/>
@@ -2787,7 +2896,518 @@
           <w:sz w:val="30"/>
           <w:szCs w:val="30"/>
         </w:rPr>
-        <w:t xml:space="preserve">4. Cómo trabajamos</w:t>
+        <w:t xml:space="preserve">4. Servicios puntuales</w:t>
+      </w:r>
+    </w:p>
+    <w:p>
+      <w:pPr>
+        <w:spacing w:after="200" w:before="0" w:line="276"/>
+      </w:pPr>
+      <w:r>
+        <w:rPr>
+          <w:rFonts w:ascii="Calibri" w:cs="Calibri" w:eastAsia="Calibri" w:hAnsi="Calibri"/>
+          <w:color w:val="666666"/>
+          <w:sz w:val="21"/>
+          <w:szCs w:val="21"/>
+        </w:rPr>
+        <w:t xml:space="preserve">Sin plan mensual, sin permanencia. También se contratan por separado:</w:t>
+      </w:r>
+    </w:p>
+    <w:tbl>
+      <w:tblPr>
+        <w:tblW w:type="dxa" w:w="9360"/>
+        <w:tblBorders>
+          <w:top w:val="single" w:color="auto" w:sz="4"/>
+          <w:left w:val="single" w:color="auto" w:sz="4"/>
+          <w:bottom w:val="single" w:color="auto" w:sz="4"/>
+          <w:right w:val="single" w:color="auto" w:sz="4"/>
+          <w:insideH w:val="single" w:color="auto" w:sz="4"/>
+          <w:insideV w:val="single" w:color="auto" w:sz="4"/>
+        </w:tblBorders>
+      </w:tblPr>
+      <w:tblGrid>
+        <w:gridCol w:w="3760"/>
+        <w:gridCol w:w="2600"/>
+        <w:gridCol w:w="3000"/>
+      </w:tblGrid>
+      <w:tr>
+        <w:tc>
+          <w:tcPr>
+            <w:tcW w:type="dxa" w:w="3760"/>
+            <w:shd w:fill="1D4ED8" w:color="auto" w:val="clear"/>
+            <w:tcMar>
+              <w:top w:type="dxa" w:w="90"/>
+              <w:left w:type="dxa" w:w="130"/>
+              <w:bottom w:type="dxa" w:w="90"/>
+              <w:right w:type="dxa" w:w="130"/>
+            </w:tcMar>
+            <w:vAlign w:val="center"/>
+          </w:tcPr>
+          <w:p>
+            <w:pPr>
+              <w:spacing w:after="0"/>
+              <w:jc w:val="left"/>
+            </w:pPr>
+            <w:r>
+              <w:rPr>
+                <w:rFonts w:ascii="Calibri" w:cs="Calibri" w:eastAsia="Calibri" w:hAnsi="Calibri"/>
+                <w:b/>
+                <w:bCs/>
+                <w:caps/>
+                <w:color w:val="FFFFFF"/>
+                <w:sz w:val="19"/>
+                <w:szCs w:val="19"/>
+              </w:rPr>
+              <w:t xml:space="preserve">Servicio</w:t>
+            </w:r>
+          </w:p>
+        </w:tc>
+        <w:tc>
+          <w:tcPr>
+            <w:tcW w:type="dxa" w:w="2600"/>
+            <w:shd w:fill="1D4ED8" w:color="auto" w:val="clear"/>
+            <w:tcMar>
+              <w:top w:type="dxa" w:w="90"/>
+              <w:left w:type="dxa" w:w="130"/>
+              <w:bottom w:type="dxa" w:w="90"/>
+              <w:right w:type="dxa" w:w="130"/>
+            </w:tcMar>
+            <w:vAlign w:val="center"/>
+          </w:tcPr>
+          <w:p>
+            <w:pPr>
+              <w:spacing w:after="0"/>
+              <w:jc w:val="center"/>
+            </w:pPr>
+            <w:r>
+              <w:rPr>
+                <w:rFonts w:ascii="Calibri" w:cs="Calibri" w:eastAsia="Calibri" w:hAnsi="Calibri"/>
+                <w:b/>
+                <w:bCs/>
+                <w:caps/>
+                <w:color w:val="FFFFFF"/>
+                <w:sz w:val="19"/>
+                <w:szCs w:val="19"/>
+              </w:rPr>
+              <w:t xml:space="preserve">Valor</w:t>
+            </w:r>
+          </w:p>
+        </w:tc>
+        <w:tc>
+          <w:tcPr>
+            <w:tcW w:type="dxa" w:w="3000"/>
+            <w:shd w:fill="1D4ED8" w:color="auto" w:val="clear"/>
+            <w:tcMar>
+              <w:top w:type="dxa" w:w="90"/>
+              <w:left w:type="dxa" w:w="130"/>
+              <w:bottom w:type="dxa" w:w="90"/>
+              <w:right w:type="dxa" w:w="130"/>
+            </w:tcMar>
+            <w:vAlign w:val="center"/>
+          </w:tcPr>
+          <w:p>
+            <w:pPr>
+              <w:spacing w:after="0"/>
+              <w:jc w:val="center"/>
+            </w:pPr>
+            <w:r>
+              <w:rPr>
+                <w:rFonts w:ascii="Calibri" w:cs="Calibri" w:eastAsia="Calibri" w:hAnsi="Calibri"/>
+                <w:b/>
+                <w:bCs/>
+                <w:caps/>
+                <w:color w:val="FFFFFF"/>
+                <w:sz w:val="19"/>
+                <w:szCs w:val="19"/>
+              </w:rPr>
+              <w:t xml:space="preserve">Condición</w:t>
+            </w:r>
+          </w:p>
+        </w:tc>
+      </w:tr>
+      <w:tr>
+        <w:tc>
+          <w:tcPr>
+            <w:tcW w:type="dxa" w:w="3760"/>
+            <w:shd w:fill="EEF3FF" w:color="auto" w:val="clear"/>
+            <w:tcMar>
+              <w:top w:type="dxa" w:w="90"/>
+              <w:left w:type="dxa" w:w="130"/>
+              <w:bottom w:type="dxa" w:w="90"/>
+              <w:right w:type="dxa" w:w="130"/>
+            </w:tcMar>
+            <w:vAlign w:val="center"/>
+          </w:tcPr>
+          <w:p>
+            <w:pPr>
+              <w:spacing w:after="0"/>
+              <w:jc w:val="left"/>
+            </w:pPr>
+            <w:r>
+              <w:rPr>
+                <w:rFonts w:ascii="Calibri" w:cs="Calibri" w:eastAsia="Calibri" w:hAnsi="Calibri"/>
+                <w:b/>
+                <w:bCs/>
+                <w:color w:val="111111"/>
+                <w:sz w:val="20"/>
+                <w:szCs w:val="20"/>
+              </w:rPr>
+              <w:t xml:space="preserve">Agente IA WhatsApp</w:t>
+            </w:r>
+          </w:p>
+        </w:tc>
+        <w:tc>
+          <w:tcPr>
+            <w:tcW w:type="dxa" w:w="2600"/>
+            <w:shd w:fill="EEF3FF" w:color="auto" w:val="clear"/>
+            <w:tcMar>
+              <w:top w:type="dxa" w:w="90"/>
+              <w:left w:type="dxa" w:w="130"/>
+              <w:bottom w:type="dxa" w:w="90"/>
+              <w:right w:type="dxa" w:w="130"/>
+            </w:tcMar>
+            <w:vAlign w:val="center"/>
+          </w:tcPr>
+          <w:p>
+            <w:pPr>
+              <w:spacing w:after="0"/>
+              <w:jc w:val="center"/>
+            </w:pPr>
+            <w:r>
+              <w:rPr>
+                <w:rFonts w:ascii="Calibri" w:cs="Calibri" w:eastAsia="Calibri" w:hAnsi="Calibri"/>
+                <w:b/>
+                <w:bCs/>
+                <w:color w:val="1D4ED8"/>
+                <w:sz w:val="20"/>
+                <w:szCs w:val="20"/>
+              </w:rPr>
+              <w:t xml:space="preserve">$119.990 / mes</w:t>
+            </w:r>
+          </w:p>
+        </w:tc>
+        <w:tc>
+          <w:tcPr>
+            <w:tcW w:type="dxa" w:w="3000"/>
+            <w:shd w:fill="EEF3FF" w:color="auto" w:val="clear"/>
+            <w:tcMar>
+              <w:top w:type="dxa" w:w="90"/>
+              <w:left w:type="dxa" w:w="130"/>
+              <w:bottom w:type="dxa" w:w="90"/>
+              <w:right w:type="dxa" w:w="130"/>
+            </w:tcMar>
+            <w:vAlign w:val="center"/>
+          </w:tcPr>
+          <w:p>
+            <w:pPr>
+              <w:spacing w:after="0"/>
+              <w:jc w:val="center"/>
+            </w:pPr>
+            <w:r>
+              <w:rPr>
+                <w:rFonts w:ascii="Calibri" w:cs="Calibri" w:eastAsia="Calibri" w:hAnsi="Calibri"/>
+                <w:color w:val="111111"/>
+                <w:sz w:val="20"/>
+                <w:szCs w:val="20"/>
+              </w:rPr>
+              <w:t xml:space="preserve">Precio de lanzamiento (después $199.990) · 300 conversaciones incluidas</w:t>
+            </w:r>
+          </w:p>
+        </w:tc>
+      </w:tr>
+      <w:tr>
+        <w:tc>
+          <w:tcPr>
+            <w:tcW w:type="dxa" w:w="3760"/>
+            <w:shd w:fill="F4F5F7" w:color="auto" w:val="clear"/>
+            <w:tcMar>
+              <w:top w:type="dxa" w:w="90"/>
+              <w:left w:type="dxa" w:w="130"/>
+              <w:bottom w:type="dxa" w:w="90"/>
+              <w:right w:type="dxa" w:w="130"/>
+            </w:tcMar>
+            <w:vAlign w:val="center"/>
+          </w:tcPr>
+          <w:p>
+            <w:pPr>
+              <w:spacing w:after="0"/>
+              <w:jc w:val="left"/>
+            </w:pPr>
+            <w:r>
+              <w:rPr>
+                <w:rFonts w:ascii="Calibri" w:cs="Calibri" w:eastAsia="Calibri" w:hAnsi="Calibri"/>
+                <w:color w:val="111111"/>
+                <w:sz w:val="20"/>
+                <w:szCs w:val="20"/>
+              </w:rPr>
+              <w:t xml:space="preserve">Sesión audiovisual</w:t>
+            </w:r>
+          </w:p>
+        </w:tc>
+        <w:tc>
+          <w:tcPr>
+            <w:tcW w:type="dxa" w:w="2600"/>
+            <w:shd w:fill="F4F5F7" w:color="auto" w:val="clear"/>
+            <w:tcMar>
+              <w:top w:type="dxa" w:w="90"/>
+              <w:left w:type="dxa" w:w="130"/>
+              <w:bottom w:type="dxa" w:w="90"/>
+              <w:right w:type="dxa" w:w="130"/>
+            </w:tcMar>
+            <w:vAlign w:val="center"/>
+          </w:tcPr>
+          <w:p>
+            <w:pPr>
+              <w:spacing w:after="0"/>
+              <w:jc w:val="center"/>
+            </w:pPr>
+            <w:r>
+              <w:rPr>
+                <w:rFonts w:ascii="Calibri" w:cs="Calibri" w:eastAsia="Calibri" w:hAnsi="Calibri"/>
+                <w:color w:val="111111"/>
+                <w:sz w:val="20"/>
+                <w:szCs w:val="20"/>
+              </w:rPr>
+              <w:t xml:space="preserve">Desde $250.000</w:t>
+            </w:r>
+          </w:p>
+        </w:tc>
+        <w:tc>
+          <w:tcPr>
+            <w:tcW w:type="dxa" w:w="3000"/>
+            <w:shd w:fill="F4F5F7" w:color="auto" w:val="clear"/>
+            <w:tcMar>
+              <w:top w:type="dxa" w:w="90"/>
+              <w:left w:type="dxa" w:w="130"/>
+              <w:bottom w:type="dxa" w:w="90"/>
+              <w:right w:type="dxa" w:w="130"/>
+            </w:tcMar>
+            <w:vAlign w:val="center"/>
+          </w:tcPr>
+          <w:p>
+            <w:pPr>
+              <w:spacing w:after="0"/>
+              <w:jc w:val="center"/>
+            </w:pPr>
+            <w:r>
+              <w:rPr>
+                <w:rFonts w:ascii="Calibri" w:cs="Calibri" w:eastAsia="Calibri" w:hAnsi="Calibri"/>
+                <w:color w:val="111111"/>
+                <w:sz w:val="20"/>
+                <w:szCs w:val="20"/>
+              </w:rPr>
+              <w:t xml:space="preserve">Pago único · según alcance</w:t>
+            </w:r>
+          </w:p>
+        </w:tc>
+      </w:tr>
+      <w:tr>
+        <w:tc>
+          <w:tcPr>
+            <w:tcW w:type="dxa" w:w="3760"/>
+            <w:shd w:fill="F4F5F7" w:color="auto" w:val="clear"/>
+            <w:tcMar>
+              <w:top w:type="dxa" w:w="90"/>
+              <w:left w:type="dxa" w:w="130"/>
+              <w:bottom w:type="dxa" w:w="90"/>
+              <w:right w:type="dxa" w:w="130"/>
+            </w:tcMar>
+            <w:vAlign w:val="center"/>
+          </w:tcPr>
+          <w:p>
+            <w:pPr>
+              <w:spacing w:after="0"/>
+              <w:jc w:val="left"/>
+            </w:pPr>
+            <w:r>
+              <w:rPr>
+                <w:rFonts w:ascii="Calibri" w:cs="Calibri" w:eastAsia="Calibri" w:hAnsi="Calibri"/>
+                <w:color w:val="111111"/>
+                <w:sz w:val="20"/>
+                <w:szCs w:val="20"/>
+              </w:rPr>
+              <w:t xml:space="preserve">Página web o tienda online</w:t>
+            </w:r>
+          </w:p>
+        </w:tc>
+        <w:tc>
+          <w:tcPr>
+            <w:tcW w:type="dxa" w:w="2600"/>
+            <w:shd w:fill="F4F5F7" w:color="auto" w:val="clear"/>
+            <w:tcMar>
+              <w:top w:type="dxa" w:w="90"/>
+              <w:left w:type="dxa" w:w="130"/>
+              <w:bottom w:type="dxa" w:w="90"/>
+              <w:right w:type="dxa" w:w="130"/>
+            </w:tcMar>
+            <w:vAlign w:val="center"/>
+          </w:tcPr>
+          <w:p>
+            <w:pPr>
+              <w:spacing w:after="0"/>
+              <w:jc w:val="center"/>
+            </w:pPr>
+            <w:r>
+              <w:rPr>
+                <w:rFonts w:ascii="Calibri" w:cs="Calibri" w:eastAsia="Calibri" w:hAnsi="Calibri"/>
+                <w:color w:val="111111"/>
+                <w:sz w:val="20"/>
+                <w:szCs w:val="20"/>
+              </w:rPr>
+              <w:t xml:space="preserve">Desde $250.000</w:t>
+            </w:r>
+          </w:p>
+        </w:tc>
+        <w:tc>
+          <w:tcPr>
+            <w:tcW w:type="dxa" w:w="3000"/>
+            <w:shd w:fill="F4F5F7" w:color="auto" w:val="clear"/>
+            <w:tcMar>
+              <w:top w:type="dxa" w:w="90"/>
+              <w:left w:type="dxa" w:w="130"/>
+              <w:bottom w:type="dxa" w:w="90"/>
+              <w:right w:type="dxa" w:w="130"/>
+            </w:tcMar>
+            <w:vAlign w:val="center"/>
+          </w:tcPr>
+          <w:p>
+            <w:pPr>
+              <w:spacing w:after="0"/>
+              <w:jc w:val="center"/>
+            </w:pPr>
+            <w:r>
+              <w:rPr>
+                <w:rFonts w:ascii="Calibri" w:cs="Calibri" w:eastAsia="Calibri" w:hAnsi="Calibri"/>
+                <w:color w:val="111111"/>
+                <w:sz w:val="20"/>
+                <w:szCs w:val="20"/>
+              </w:rPr>
+              <w:t xml:space="preserve">Pago único · hosting + dominio 1 año</w:t>
+            </w:r>
+          </w:p>
+        </w:tc>
+      </w:tr>
+      <w:tr>
+        <w:tc>
+          <w:tcPr>
+            <w:tcW w:type="dxa" w:w="3760"/>
+            <w:shd w:fill="F4F5F7" w:color="auto" w:val="clear"/>
+            <w:tcMar>
+              <w:top w:type="dxa" w:w="90"/>
+              <w:left w:type="dxa" w:w="130"/>
+              <w:bottom w:type="dxa" w:w="90"/>
+              <w:right w:type="dxa" w:w="130"/>
+            </w:tcMar>
+            <w:vAlign w:val="center"/>
+          </w:tcPr>
+          <w:p>
+            <w:pPr>
+              <w:spacing w:after="0"/>
+              <w:jc w:val="left"/>
+            </w:pPr>
+            <w:r>
+              <w:rPr>
+                <w:rFonts w:ascii="Calibri" w:cs="Calibri" w:eastAsia="Calibri" w:hAnsi="Calibri"/>
+                <w:color w:val="111111"/>
+                <w:sz w:val="20"/>
+                <w:szCs w:val="20"/>
+              </w:rPr>
+              <w:t xml:space="preserve">Setup y auditoría de Meta Ads</w:t>
+            </w:r>
+          </w:p>
+        </w:tc>
+        <w:tc>
+          <w:tcPr>
+            <w:tcW w:type="dxa" w:w="2600"/>
+            <w:shd w:fill="F4F5F7" w:color="auto" w:val="clear"/>
+            <w:tcMar>
+              <w:top w:type="dxa" w:w="90"/>
+              <w:left w:type="dxa" w:w="130"/>
+              <w:bottom w:type="dxa" w:w="90"/>
+              <w:right w:type="dxa" w:w="130"/>
+            </w:tcMar>
+            <w:vAlign w:val="center"/>
+          </w:tcPr>
+          <w:p>
+            <w:pPr>
+              <w:spacing w:after="0"/>
+              <w:jc w:val="center"/>
+            </w:pPr>
+            <w:r>
+              <w:rPr>
+                <w:rFonts w:ascii="Calibri" w:cs="Calibri" w:eastAsia="Calibri" w:hAnsi="Calibri"/>
+                <w:color w:val="111111"/>
+                <w:sz w:val="20"/>
+                <w:szCs w:val="20"/>
+              </w:rPr>
+              <w:t xml:space="preserve">Desde $150.000</w:t>
+            </w:r>
+          </w:p>
+        </w:tc>
+        <w:tc>
+          <w:tcPr>
+            <w:tcW w:type="dxa" w:w="3000"/>
+            <w:shd w:fill="F4F5F7" w:color="auto" w:val="clear"/>
+            <w:tcMar>
+              <w:top w:type="dxa" w:w="90"/>
+              <w:left w:type="dxa" w:w="130"/>
+              <w:bottom w:type="dxa" w:w="90"/>
+              <w:right w:type="dxa" w:w="130"/>
+            </w:tcMar>
+            <w:vAlign w:val="center"/>
+          </w:tcPr>
+          <w:p>
+            <w:pPr>
+              <w:spacing w:after="0"/>
+              <w:jc w:val="center"/>
+            </w:pPr>
+            <w:r>
+              <w:rPr>
+                <w:rFonts w:ascii="Calibri" w:cs="Calibri" w:eastAsia="Calibri" w:hAnsi="Calibri"/>
+                <w:color w:val="111111"/>
+                <w:sz w:val="20"/>
+                <w:szCs w:val="20"/>
+              </w:rPr>
+              <w:t xml:space="preserve">Pago único</w:t>
+            </w:r>
+          </w:p>
+        </w:tc>
+      </w:tr>
+    </w:tbl>
+    <w:p>
+      <w:pPr>
+        <w:spacing w:after="0" w:before="140" w:line="276"/>
+      </w:pPr>
+      <w:r>
+        <w:rPr>
+          <w:rFonts w:ascii="Calibri" w:cs="Calibri" w:eastAsia="Calibri" w:hAnsi="Calibri"/>
+          <w:i/>
+          <w:iCs/>
+          <w:color w:val="666666"/>
+          <w:sz w:val="18"/>
+          <w:szCs w:val="18"/>
+        </w:rPr>
+        <w:t xml:space="preserve">Los valores de sesión audiovisual, página web y setup de Ads son referenciales — se confirman según el alcance del proyecto.</w:t>
+      </w:r>
+    </w:p>
+    <w:p>
+      <w:pPr>
+        <w:pStyle w:val="Heading1"/>
+        <w:pBdr>
+          <w:bottom w:val="single" w:color="1D4ED8" w:sz="12" w:space="6"/>
+        </w:pBdr>
+        <w:spacing w:after="160" w:before="360"/>
+      </w:pPr>
+      <w:r>
+        <w:rPr>
+          <w:rFonts w:ascii="Calibri" w:cs="Calibri" w:eastAsia="Calibri" w:hAnsi="Calibri"/>
+          <w:b/>
+          <w:bCs/>
+          <w:color w:val="111111"/>
+          <w:sz w:val="30"/>
+          <w:szCs w:val="30"/>
+        </w:rPr>
+        <w:t xml:space="preserve">5. Cómo trabajamos</w:t>
       </w:r>
     </w:p>
     <w:p>
@@ -3011,7 +3631,7 @@
           <w:sz w:val="30"/>
           <w:szCs w:val="30"/>
         </w:rPr>
-        <w:t xml:space="preserve">5. Garantías</w:t>
+        <w:t xml:space="preserve">6. Garantías</w:t>
       </w:r>
     </w:p>
     <w:tbl>
@@ -3225,7 +3845,7 @@
           <w:sz w:val="30"/>
           <w:szCs w:val="30"/>
         </w:rPr>
-        <w:t xml:space="preserve">6. Condiciones comerciales</w:t>
+        <w:t xml:space="preserve">7. Condiciones comerciales</w:t>
       </w:r>
     </w:p>
     <w:p>
@@ -3439,7 +4059,7 @@
           <w:sz w:val="30"/>
           <w:szCs w:val="30"/>
         </w:rPr>
-        <w:t xml:space="preserve">7. Próximos pasos</w:t>
+        <w:t xml:space="preserve">8. Próximos pasos</w:t>
       </w:r>
     </w:p>
     <w:p>
@@ -3516,6 +4136,46 @@
           <w:szCs w:val="21"/>
         </w:rPr>
         <w:t xml:space="preserve">Onboarding y activación en 48 a 72 horas desde la confirmación.</w:t>
+      </w:r>
+    </w:p>
+    <w:p>
+      <w:pPr>
+        <w:spacing w:after="0" w:before="160" w:line="276"/>
+      </w:pPr>
+      <w:r>
+        <w:rPr>
+          <w:rFonts w:ascii="Calibri" w:cs="Calibri" w:eastAsia="Calibri" w:hAnsi="Calibri"/>
+          <w:i/>
+          <w:iCs/>
+          <w:color w:val="666666"/>
+          <w:sz w:val="19"/>
+          <w:szCs w:val="19"/>
+        </w:rPr>
+        <w:t xml:space="preserve">¿Necesitas varias sucursales, más volumen o un lanzamiento grande? Armamos un proyecto a medida desde </w:t>
+      </w:r>
+      <w:r>
+        <w:rPr>
+          <w:rFonts w:ascii="Calibri" w:cs="Calibri" w:eastAsia="Calibri" w:hAnsi="Calibri"/>
+          <w:b/>
+          <w:bCs/>
+          <w:i/>
+          <w:iCs/>
+          <w:color w:val="1D4ED8"/>
+          <w:sz w:val="19"/>
+          <w:szCs w:val="19"/>
+        </w:rPr>
+        <w:t xml:space="preserve">$500.000/mes</w:t>
+      </w:r>
+      <w:r>
+        <w:rPr>
+          <w:rFonts w:ascii="Calibri" w:cs="Calibri" w:eastAsia="Calibri" w:hAnsi="Calibri"/>
+          <w:i/>
+          <w:iCs/>
+          <w:color w:val="666666"/>
+          <w:sz w:val="19"/>
+          <w:szCs w:val="19"/>
+        </w:rPr>
+        <w:t xml:space="preserve">.</w:t>
       </w:r>
     </w:p>
     <w:p>

</xml_diff>